<commit_message>
Regenerate the submission document from the updated text
</commit_message>
<xml_diff>
--- a/docs/SUBMISSION.docx
+++ b/docs/SUBMISSION.docx
@@ -797,6 +797,86 @@
     </w:p>
     <w:p>
       <w:pPr>
+        <w:pStyle w:val="BodyText"/>
+      </w:pPr>
+      <w:r>
+        <w:t xml:space="preserve">Each agent call also names the identity it acts</w:t>
+      </w:r>
+      <w:r>
+        <w:t xml:space="preserve"> </w:t>
+      </w:r>
+      <w:r>
+        <w:rPr>
+          <w:i/>
+        </w:rPr>
+        <w:t xml:space="preserve">for</w:t>
+      </w:r>
+      <w:r>
+        <w:t xml:space="preserve"> </w:t>
+      </w:r>
+      <w:r>
+        <w:t xml:space="preserve">(</w:t>
+      </w:r>
+      <w:r>
+        <w:rPr>
+          <w:rStyle w:val="VerbatimChar"/>
+        </w:rPr>
+        <w:t xml:space="preserve">pii_did</w:t>
+      </w:r>
+      <w:r>
+        <w:t xml:space="preserve"> </w:t>
+      </w:r>
+      <w:r>
+        <w:t xml:space="preserve">= the delegator).</w:t>
+      </w:r>
+      <w:r>
+        <w:t xml:space="preserve"> </w:t>
+      </w:r>
+      <w:r>
+        <w:t xml:space="preserve">That is not decoration: the enclave resolves the contract’s outbound-host allowlist</w:t>
+      </w:r>
+      <w:r>
+        <w:t xml:space="preserve"> </w:t>
+      </w:r>
+      <w:r>
+        <w:t xml:space="preserve">per call from that identity’s grant, and a call that names nobody is treated as a</w:t>
+      </w:r>
+      <w:r>
+        <w:t xml:space="preserve"> </w:t>
+      </w:r>
+      <w:r>
+        <w:t xml:space="preserve">self call — the agent holds no grant of its own, so the grant on the delegator’s</w:t>
+      </w:r>
+      <w:r>
+        <w:t xml:space="preserve"> </w:t>
+      </w:r>
+      <w:r>
+        <w:t xml:space="preserve">document is invisible to the resolver.</w:t>
+      </w:r>
+      <w:r>
+        <w:t xml:space="preserve"> </w:t>
+      </w:r>
+      <w:r>
+        <w:rPr>
+          <w:rStyle w:val="VerbatimChar"/>
+        </w:rPr>
+        <w:t xml:space="preserve">BUG-14</w:t>
+      </w:r>
+      <w:r>
+        <w:t xml:space="preserve"> </w:t>
+      </w:r>
+      <w:r>
+        <w:t xml:space="preserve">is what that looks like from the</w:t>
+      </w:r>
+      <w:r>
+        <w:t xml:space="preserve"> </w:t>
+      </w:r>
+      <w:r>
+        <w:t xml:space="preserve">outside.</w:t>
+      </w:r>
+    </w:p>
+    <w:p>
+      <w:pPr>
         <w:pStyle w:val="Heading2"/>
       </w:pPr>
       <w:bookmarkStart w:id="24" w:name="deployed-and-verified"/>
@@ -1012,6 +1092,81 @@
               <w:jc w:val="left"/>
             </w:pPr>
             <w:r>
+              <w:t xml:space="preserve">live demo</w:t>
+            </w:r>
+          </w:p>
+        </w:tc>
+        <w:tc>
+          <w:p>
+            <w:pPr>
+              <w:pStyle w:val="Compact"/>
+              <w:jc w:val="left"/>
+            </w:pPr>
+            <w:r>
+              <w:t xml:space="preserve">8 of 8 steps green, run twice back to back — health, delegation, policy, FX-converted verdict, duplicate, threshold, rejection, ledger read-back</w:t>
+            </w:r>
+          </w:p>
+        </w:tc>
+      </w:tr>
+      <w:tr>
+        <w:tc>
+          <w:p>
+            <w:pPr>
+              <w:pStyle w:val="Compact"/>
+              <w:jc w:val="left"/>
+            </w:pPr>
+            <w:r>
+              <w:t xml:space="preserve">outbound HTTP from the enclave</w:t>
+            </w:r>
+          </w:p>
+        </w:tc>
+        <w:tc>
+          <w:p>
+            <w:pPr>
+              <w:pStyle w:val="Compact"/>
+              <w:jc w:val="left"/>
+            </w:pPr>
+            <w:r>
+              <w:t xml:space="preserve">real:</w:t>
+            </w:r>
+            <w:r>
+              <w:t xml:space="preserve"> </w:t>
+            </w:r>
+            <w:r>
+              <w:rPr>
+                <w:rStyle w:val="VerbatimChar"/>
+              </w:rPr>
+              <w:t xml:space="preserve">fx_source: open.er-api.com</w:t>
+            </w:r>
+            <w:r>
+              <w:t xml:space="preserve">,</w:t>
+            </w:r>
+            <w:r>
+              <w:t xml:space="preserve"> </w:t>
+            </w:r>
+            <w:r>
+              <w:rPr>
+                <w:rStyle w:val="VerbatimChar"/>
+              </w:rPr>
+              <w:t xml:space="preserve">fx_rate: 1.153788</w:t>
+            </w:r>
+            <w:r>
+              <w:t xml:space="preserve"> </w:t>
+            </w:r>
+            <w:r>
+              <w:t xml:space="preserve">for a EUR claim</w:t>
+            </w:r>
+          </w:p>
+        </w:tc>
+      </w:tr>
+      <w:tr>
+        <w:tc>
+          <w:p>
+            <w:pPr>
+              <w:pStyle w:val="Compact"/>
+              <w:jc w:val="left"/>
+            </w:pPr>
+            <w:r>
               <w:t xml:space="preserve">tenant DID</w:t>
             </w:r>
           </w:p>
@@ -1142,22 +1297,37 @@
         <w:t xml:space="preserve"> </w:t>
       </w:r>
       <w:r>
-        <w:t xml:space="preserve">documents 14 defects we hit and reproduced, each with the file and line, a verbatim error, and a proposed fix. The one that cost us the most is also the cheapest to fix: the delegation write accepted a row the resolver then ignored —</w:t>
-      </w:r>
-      <w:r>
-        <w:t xml:space="preserve"> </w:t>
-      </w:r>
-      <w:r>
-        <w:rPr>
-          <w:rStyle w:val="VerbatimChar"/>
-        </w:rPr>
-        <w:t xml:space="preserve">member-delegation-update</w:t>
-      </w:r>
-      <w:r>
-        <w:t xml:space="preserve"> </w:t>
-      </w:r>
-      <w:r>
-        <w:t xml:space="preserve">returned success and</w:t>
+        <w:t xml:space="preserve">documents 15 defects we hit and reproduced, each with the file and line, a verbatim error, and a proposed fix. The one that cost us the most is also the cheapest to fix: an agent call that names no acting identity is resolved as a</w:t>
+      </w:r>
+      <w:r>
+        <w:t xml:space="preserve"> </w:t>
+      </w:r>
+      <w:r>
+        <w:rPr>
+          <w:b/>
+        </w:rPr>
+        <w:t xml:space="preserve">self</w:t>
+      </w:r>
+      <w:r>
+        <w:t xml:space="preserve"> </w:t>
+      </w:r>
+      <w:r>
+        <w:t xml:space="preserve">call, so the enclave looks for the contract’s egress grant on the agent’s own document, finds nothing, and denies the contract’s outbound HTTP with</w:t>
+      </w:r>
+      <w:r>
+        <w:t xml:space="preserve"> </w:t>
+      </w:r>
+      <w:r>
+        <w:rPr>
+          <w:rStyle w:val="VerbatimChar"/>
+        </w:rPr>
+        <w:t xml:space="preserve">host/http.egress_denied ... not in the resolved allowlist []</w:t>
+      </w:r>
+      <w:r>
+        <w:t xml:space="preserve"> </w:t>
+      </w:r>
+      <w:r>
+        <w:t xml:space="preserve">— while the correct grant sits on the delegator’s document, echoed back intact by</w:t>
       </w:r>
       <w:r>
         <w:t xml:space="preserve"> </w:t>
@@ -1169,37 +1339,73 @@
         <w:t xml:space="preserve">member-delegation-get</w:t>
       </w:r>
       <w:r>
-        <w:t xml:space="preserve"> </w:t>
-      </w:r>
-      <w:r>
-        <w:t xml:space="preserve">echoed the row back, while the enclave resolved an</w:t>
-      </w:r>
-      <w:r>
-        <w:t xml:space="preserve"> </w:t>
-      </w:r>
-      <w:r>
-        <w:rPr>
-          <w:b/>
-        </w:rPr>
-        <w:t xml:space="preserve">empty</w:t>
-      </w:r>
-      <w:r>
-        <w:t xml:space="preserve"> </w:t>
-      </w:r>
-      <w:r>
-        <w:t xml:space="preserve">egress allowlist and denied the contract’s own HTTP call as</w:t>
-      </w:r>
-      <w:r>
-        <w:t xml:space="preserve"> </w:t>
-      </w:r>
-      <w:r>
-        <w:rPr>
-          <w:rStyle w:val="VerbatimChar"/>
-        </w:rPr>
-        <w:t xml:space="preserve">host/http.egress_denied ... not in the resolved allowlist []</w:t>
-      </w:r>
-      <w:r>
-        <w:t xml:space="preserve">. Every signal said the write had worked. The others range from a duplicate import that stops the documented first paste from compiling, through a</w:t>
+        <w:t xml:space="preserve">. Every signal said the write had worked, and the one API that exists to name the missing edge,</w:t>
+      </w:r>
+      <w:r>
+        <w:t xml:space="preserve"> </w:t>
+      </w:r>
+      <w:r>
+        <w:rPr>
+          <w:rStyle w:val="VerbatimChar"/>
+        </w:rPr>
+        <w:t xml:space="preserve">discoverCheckDelegation</w:t>
+      </w:r>
+      <w:r>
+        <w:t xml:space="preserve">, returned</w:t>
+      </w:r>
+      <w:r>
+        <w:t xml:space="preserve"> </w:t>
+      </w:r>
+      <w:r>
+        <w:rPr>
+          <w:rStyle w:val="VerbatimChar"/>
+        </w:rPr>
+        <w:t xml:space="preserve">authorised: false</w:t>
+      </w:r>
+      <w:r>
+        <w:t xml:space="preserve"> </w:t>
+      </w:r>
+      <w:r>
+        <w:t xml:space="preserve">with an empty</w:t>
+      </w:r>
+      <w:r>
+        <w:t xml:space="preserve"> </w:t>
+      </w:r>
+      <w:r>
+        <w:rPr>
+          <w:rStyle w:val="VerbatimChar"/>
+        </w:rPr>
+        <w:t xml:space="preserve">missing</w:t>
+      </w:r>
+      <w:r>
+        <w:t xml:space="preserve"> </w:t>
+      </w:r>
+      <w:r>
+        <w:t xml:space="preserve">list. A second one belongs in the same report: the SDK’s declared grant row (</w:t>
+      </w:r>
+      <w:r>
+        <w:rPr>
+          <w:rStyle w:val="VerbatimChar"/>
+        </w:rPr>
+        <w:t xml:space="preserve">function: string</w:t>
+      </w:r>
+      <w:r>
+        <w:t xml:space="preserve">, with a comment describing the multi-function form as retired) is rejected by the node outright, which accepts</w:t>
+      </w:r>
+      <w:r>
+        <w:t xml:space="preserve"> </w:t>
+      </w:r>
+      <w:r>
+        <w:rPr>
+          <w:rStyle w:val="VerbatimChar"/>
+        </w:rPr>
+        <w:t xml:space="preserve">functions: [...]</w:t>
+      </w:r>
+      <w:r>
+        <w:t xml:space="preserve"> </w:t>
+      </w:r>
+      <w:r>
+        <w:t xml:space="preserve">— the shape the docs use. The others range from a duplicate import that stops the documented first paste from compiling, through a</w:t>
       </w:r>
       <w:r>
         <w:t xml:space="preserve"> </w:t>

</xml_diff>

<commit_message>
Add the post-challenge handover section the listing asks for
</commit_message>
<xml_diff>
--- a/docs/SUBMISSION.docx
+++ b/docs/SUBMISSION.docx
@@ -1103,7 +1103,22 @@
               <w:jc w:val="left"/>
             </w:pPr>
             <w:r>
-              <w:t xml:space="preserve">8 of 8 steps green, run twice back to back — health, delegation, policy, FX-converted verdict, duplicate, threshold, rejection, ledger read-back</w:t>
+              <w:t xml:space="preserve">8 of 8 steps green on four consecutive runs, one of them via the documented</w:t>
+            </w:r>
+            <w:r>
+              <w:t xml:space="preserve"> </w:t>
+            </w:r>
+            <w:r>
+              <w:rPr>
+                <w:rStyle w:val="VerbatimChar"/>
+              </w:rPr>
+              <w:t xml:space="preserve">npm run demo</w:t>
+            </w:r>
+            <w:r>
+              <w:t xml:space="preserve"> </w:t>
+            </w:r>
+            <w:r>
+              <w:t xml:space="preserve">— health, delegation, policy, FX-converted verdict, duplicate, threshold, rejection, ledger read-back</w:t>
             </w:r>
           </w:p>
         </w:tc>
@@ -1765,6 +1780,231 @@
       </w:r>
       <w:r>
         <w:t xml:space="preserve">is the frozen contract interface.</w:t>
+      </w:r>
+    </w:p>
+    <w:p>
+      <w:pPr>
+        <w:pStyle w:val="Heading2"/>
+      </w:pPr>
+      <w:bookmarkStart w:id="27" w:name="running-it-after-the-challenge"/>
+      <w:r>
+        <w:t xml:space="preserve">Running it after the challenge</w:t>
+      </w:r>
+      <w:bookmarkEnd w:id="27"/>
+    </w:p>
+    <w:p>
+      <w:pPr>
+        <w:pStyle w:val="FirstParagraph"/>
+      </w:pPr>
+      <w:r>
+        <w:rPr>
+          <w:rStyle w:val="VerbatimChar"/>
+        </w:rPr>
+        <w:t xml:space="preserve">docs/RUNBOOK.md</w:t>
+      </w:r>
+      <w:r>
+        <w:t xml:space="preserve"> </w:t>
+      </w:r>
+      <w:r>
+        <w:t xml:space="preserve">is the operator’s document: the deploy order, the expected output at every step, and the failure modes we actually hit. Nothing in the running system is bound to our accounts, so either path works:</w:t>
+      </w:r>
+    </w:p>
+    <w:p>
+      <w:pPr>
+        <w:numPr>
+          <w:ilvl w:val="0"/>
+          <w:numId w:val="1002"/>
+        </w:numPr>
+        <w:pStyle w:val="Compact"/>
+      </w:pPr>
+      <w:r>
+        <w:rPr>
+          <w:b/>
+        </w:rPr>
+        <w:t xml:space="preserve">We keep running it.</w:t>
+      </w:r>
+      <w:r>
+        <w:t xml:space="preserve"> </w:t>
+      </w:r>
+      <w:r>
+        <w:t xml:space="preserve">The tenant org, the agent and the registration stay ours; cost is metered per call through the host’s</w:t>
+      </w:r>
+      <w:r>
+        <w:t xml:space="preserve"> </w:t>
+      </w:r>
+      <w:r>
+        <w:rPr>
+          <w:rStyle w:val="VerbatimChar"/>
+        </w:rPr>
+        <w:t xml:space="preserve">token</w:t>
+      </w:r>
+      <w:r>
+        <w:t xml:space="preserve"> </w:t>
+      </w:r>
+      <w:r>
+        <w:t xml:space="preserve">capability, and the harness is one</w:t>
+      </w:r>
+      <w:r>
+        <w:t xml:space="preserve"> </w:t>
+      </w:r>
+      <w:r>
+        <w:rPr>
+          <w:rStyle w:val="VerbatimChar"/>
+        </w:rPr>
+        <w:t xml:space="preserve">npm ci</w:t>
+      </w:r>
+      <w:r>
+        <w:t xml:space="preserve"> </w:t>
+      </w:r>
+      <w:r>
+        <w:t xml:space="preserve">away from working.</w:t>
+      </w:r>
+    </w:p>
+    <w:p>
+      <w:pPr>
+        <w:numPr>
+          <w:ilvl w:val="0"/>
+          <w:numId w:val="1002"/>
+        </w:numPr>
+        <w:pStyle w:val="Compact"/>
+      </w:pPr>
+      <w:r>
+        <w:rPr>
+          <w:b/>
+        </w:rPr>
+        <w:t xml:space="preserve">Handover to Terminal 3.</w:t>
+      </w:r>
+      <w:r>
+        <w:t xml:space="preserve"> </w:t>
+      </w:r>
+      <w:r>
+        <w:t xml:space="preserve">The transferable surface is deliberately small — a wasm artifact, one registration call, four KV maps, one delegation document, one secrets row. A new operator needs a tenant with credits, an agent, and the values listed in</w:t>
+      </w:r>
+      <w:r>
+        <w:t xml:space="preserve"> </w:t>
+      </w:r>
+      <w:r>
+        <w:rPr>
+          <w:rStyle w:val="VerbatimChar"/>
+        </w:rPr>
+        <w:t xml:space="preserve">client/.env.example</w:t>
+      </w:r>
+      <w:r>
+        <w:t xml:space="preserve">, which documents every variable including the two traps:</w:t>
+      </w:r>
+      <w:r>
+        <w:t xml:space="preserve"> </w:t>
+      </w:r>
+      <w:r>
+        <w:rPr>
+          <w:rStyle w:val="VerbatimChar"/>
+        </w:rPr>
+        <w:t xml:space="preserve">AGENT_INVOKE_KEY</w:t>
+      </w:r>
+      <w:r>
+        <w:t xml:space="preserve"> </w:t>
+      </w:r>
+      <w:r>
+        <w:t xml:space="preserve">is a bearer token printed exactly once at agent creation, and</w:t>
+      </w:r>
+      <w:r>
+        <w:t xml:space="preserve"> </w:t>
+      </w:r>
+      <w:r>
+        <w:rPr>
+          <w:rStyle w:val="VerbatimChar"/>
+        </w:rPr>
+        <w:t xml:space="preserve">PII_DID</w:t>
+      </w:r>
+      <w:r>
+        <w:t xml:space="preserve"> </w:t>
+      </w:r>
+      <w:r>
+        <w:t xml:space="preserve">must name the delegator or egress resolves to an empty allowlist (</w:t>
+      </w:r>
+      <w:r>
+        <w:rPr>
+          <w:rStyle w:val="VerbatimChar"/>
+        </w:rPr>
+        <w:t xml:space="preserve">BUG-14</w:t>
+      </w:r>
+      <w:r>
+        <w:t xml:space="preserve">).</w:t>
+      </w:r>
+      <w:r>
+        <w:t xml:space="preserve"> </w:t>
+      </w:r>
+      <w:r>
+        <w:rPr>
+          <w:rStyle w:val="VerbatimChar"/>
+        </w:rPr>
+        <w:t xml:space="preserve">deploy.ts</w:t>
+      </w:r>
+      <w:r>
+        <w:t xml:space="preserve"> </w:t>
+      </w:r>
+      <w:r>
+        <w:t xml:space="preserve">recreates the contract, the maps and the policy;</w:t>
+      </w:r>
+      <w:r>
+        <w:t xml:space="preserve"> </w:t>
+      </w:r>
+      <w:r>
+        <w:rPr>
+          <w:rStyle w:val="VerbatimChar"/>
+        </w:rPr>
+        <w:t xml:space="preserve">deploy.ts --seed-only</w:t>
+      </w:r>
+      <w:r>
+        <w:t xml:space="preserve"> </w:t>
+      </w:r>
+      <w:r>
+        <w:t xml:space="preserve">re-seeds the secrets row;</w:t>
+      </w:r>
+      <w:r>
+        <w:t xml:space="preserve"> </w:t>
+      </w:r>
+      <w:r>
+        <w:rPr>
+          <w:rStyle w:val="VerbatimChar"/>
+        </w:rPr>
+        <w:t xml:space="preserve">grant.ts</w:t>
+      </w:r>
+      <w:r>
+        <w:t xml:space="preserve"> </w:t>
+      </w:r>
+      <w:r>
+        <w:t xml:space="preserve">rewrites the delegation idempotently;</w:t>
+      </w:r>
+      <w:r>
+        <w:t xml:space="preserve"> </w:t>
+      </w:r>
+      <w:r>
+        <w:rPr>
+          <w:rStyle w:val="VerbatimChar"/>
+        </w:rPr>
+        <w:t xml:space="preserve">npm run doctor</w:t>
+      </w:r>
+      <w:r>
+        <w:t xml:space="preserve"> </w:t>
+      </w:r>
+      <w:r>
+        <w:t xml:space="preserve">names anything still missing.</w:t>
+      </w:r>
+      <w:r>
+        <w:t xml:space="preserve"> </w:t>
+      </w:r>
+      <w:r>
+        <w:rPr>
+          <w:rStyle w:val="VerbatimChar"/>
+        </w:rPr>
+        <w:t xml:space="preserve">AGENTS.md</w:t>
+      </w:r>
+      <w:r>
+        <w:t xml:space="preserve"> </w:t>
+      </w:r>
+      <w:r>
+        <w:t xml:space="preserve">carries the same contract for whoever picks the repository up next.</w:t>
       </w:r>
     </w:p>
     <w:sectPr/>
@@ -2007,6 +2247,9 @@
     <w:abstractNumId w:val="990"/>
   </w:num>
   <w:num w:numId="1001">
+    <w:abstractNumId w:val="991"/>
+  </w:num>
+  <w:num w:numId="1002">
     <w:abstractNumId w:val="991"/>
   </w:num>
 </w:numbering>

</xml_diff>

<commit_message>
Point the submission document at the public repository
</commit_message>
<xml_diff>
--- a/docs/SUBMISSION.docx
+++ b/docs/SUBMISSION.docx
@@ -26,22 +26,7 @@
         <w:t xml:space="preserve"> </w:t>
       </w:r>
       <w:r>
-        <w:t xml:space="preserve">Repository:</w:t>
-      </w:r>
-      <w:r>
-        <w:t xml:space="preserve"> </w:t>
-      </w:r>
-      <w:r>
-        <w:rPr>
-          <w:rStyle w:val="VerbatimChar"/>
-        </w:rPr>
-        <w:t xml:space="preserve">&lt;REPO_URL&gt;</w:t>
-      </w:r>
-      <w:r>
-        <w:t xml:space="preserve"> </w:t>
-      </w:r>
-      <w:r>
-        <w:t xml:space="preserve">· Demo transcript:</w:t>
+        <w:t xml:space="preserve">Repository: https://github.com/tomirahman/t3n-expense-guard · Demo transcript:</w:t>
       </w:r>
       <w:r>
         <w:t xml:space="preserve"> </w:t>

</xml_diff>

<commit_message>
Add the handover document and the license, and fix the stale layout listing
</commit_message>
<xml_diff>
--- a/docs/SUBMISSION.docx
+++ b/docs/SUBMISSION.docx
@@ -1990,6 +1990,23 @@
       </w:r>
       <w:r>
         <w:t xml:space="preserve">carries the same contract for whoever picks the repository up next.</w:t>
+      </w:r>
+    </w:p>
+    <w:p>
+      <w:pPr>
+        <w:pStyle w:val="FirstParagraph"/>
+      </w:pPr>
+      <w:r>
+        <w:rPr>
+          <w:rStyle w:val="VerbatimChar"/>
+        </w:rPr>
+        <w:t xml:space="preserve">docs/HANDOVER.md</w:t>
+      </w:r>
+      <w:r>
+        <w:t xml:space="preserve"> </w:t>
+      </w:r>
+      <w:r>
+        <w:t xml:space="preserve">is the full checklist: provisioning order, the credentials each identity needs, preflight, the traps, and what we would do before running this for real.</w:t>
       </w:r>
     </w:p>
     <w:sectPr/>

</xml_diff>

<commit_message>
Embed both captures in the submission document at a page-friendly size
</commit_message>
<xml_diff>
--- a/docs/SUBMISSION.docx
+++ b/docs/SUBMISSION.docx
@@ -1231,10 +1231,164 @@
     </w:tbl>
     <w:p>
       <w:pPr>
+        <w:pStyle w:val="Heading2"/>
+      </w:pPr>
+      <w:bookmarkStart w:id="25" w:name="screenshots"/>
+      <w:r>
+        <w:t xml:space="preserve">Screenshots</w:t>
+      </w:r>
+      <w:bookmarkEnd w:id="25"/>
+    </w:p>
+    <w:p>
+      <w:pPr>
+        <w:pStyle w:val="FirstParagraph"/>
+      </w:pPr>
+      <w:r>
+        <w:rPr>
+          <w:rStyle w:val="VerbatimChar"/>
+        </w:rPr>
+        <w:t xml:space="preserve">npm run doctor</w:t>
+      </w:r>
+      <w:r>
+        <w:t xml:space="preserve"> </w:t>
+      </w:r>
+      <w:r>
+        <w:t xml:space="preserve">— all 21 preflight checks, run against the live cluster:</w:t>
+      </w:r>
+    </w:p>
+    <w:p>
+      <w:pPr>
+        <w:pStyle w:val="CaptionedFigure"/>
+      </w:pPr>
+      <w:r>
+        <w:drawing>
+          <wp:inline>
+            <wp:extent cx="5486400" cy="3074212"/>
+            <wp:effectExtent b="0" l="0" r="0" t="0"/>
+            <wp:docPr descr="doctor — 21 preflight checks before anything is registered" title="" id="1" name="Picture"/>
+            <a:graphic>
+              <a:graphicData uri="http://schemas.openxmlformats.org/drawingml/2006/picture">
+                <pic:pic>
+                  <pic:nvPicPr>
+                    <pic:cNvPr descr="evidence/doctor.png" id="0" name="Picture"/>
+                    <pic:cNvPicPr>
+                      <a:picLocks noChangeArrowheads="1" noChangeAspect="1"/>
+                    </pic:cNvPicPr>
+                  </pic:nvPicPr>
+                  <pic:blipFill>
+                    <a:blip r:embed="rId26"/>
+                    <a:stretch>
+                      <a:fillRect/>
+                    </a:stretch>
+                  </pic:blipFill>
+                  <pic:spPr bwMode="auto">
+                    <a:xfrm>
+                      <a:off x="0" y="0"/>
+                      <a:ext cx="5486400" cy="3074212"/>
+                    </a:xfrm>
+                    <a:prstGeom prst="rect">
+                      <a:avLst/>
+                    </a:prstGeom>
+                    <a:noFill/>
+                    <a:ln w="9525">
+                      <a:noFill/>
+                      <a:headEnd/>
+                      <a:tailEnd/>
+                    </a:ln>
+                  </pic:spPr>
+                </pic:pic>
+              </a:graphicData>
+            </a:graphic>
+          </wp:inline>
+        </w:drawing>
+      </w:r>
+    </w:p>
+    <w:p>
+      <w:pPr>
+        <w:pStyle w:val="ImageCaption"/>
+      </w:pPr>
+      <w:r>
+        <w:t xml:space="preserve">doctor — 21 preflight checks before anything is registered</w:t>
+      </w:r>
+    </w:p>
+    <w:p>
+      <w:pPr>
         <w:pStyle w:val="BodyText"/>
       </w:pPr>
       <w:r>
         <w:rPr>
+          <w:rStyle w:val="VerbatimChar"/>
+        </w:rPr>
+        <w:t xml:space="preserve">npm run demo</w:t>
+      </w:r>
+      <w:r>
+        <w:t xml:space="preserve"> </w:t>
+      </w:r>
+      <w:r>
+        <w:t xml:space="preserve">— one full agent session, 8 of 8 steps green:</w:t>
+      </w:r>
+    </w:p>
+    <w:p>
+      <w:pPr>
+        <w:pStyle w:val="CaptionedFigure"/>
+      </w:pPr>
+      <w:r>
+        <w:drawing>
+          <wp:inline>
+            <wp:extent cx="3200400" cy="7425842"/>
+            <wp:effectExtent b="0" l="0" r="0" t="0"/>
+            <wp:docPr descr="demo — 8 of 8 steps green" title="" id="1" name="Picture"/>
+            <a:graphic>
+              <a:graphicData uri="http://schemas.openxmlformats.org/drawingml/2006/picture">
+                <pic:pic>
+                  <pic:nvPicPr>
+                    <pic:cNvPr descr="evidence/demo.png" id="0" name="Picture"/>
+                    <pic:cNvPicPr>
+                      <a:picLocks noChangeArrowheads="1" noChangeAspect="1"/>
+                    </pic:cNvPicPr>
+                  </pic:nvPicPr>
+                  <pic:blipFill>
+                    <a:blip r:embed="rId27"/>
+                    <a:stretch>
+                      <a:fillRect/>
+                    </a:stretch>
+                  </pic:blipFill>
+                  <pic:spPr bwMode="auto">
+                    <a:xfrm>
+                      <a:off x="0" y="0"/>
+                      <a:ext cx="3200400" cy="7425842"/>
+                    </a:xfrm>
+                    <a:prstGeom prst="rect">
+                      <a:avLst/>
+                    </a:prstGeom>
+                    <a:noFill/>
+                    <a:ln w="9525">
+                      <a:noFill/>
+                      <a:headEnd/>
+                      <a:tailEnd/>
+                    </a:ln>
+                  </pic:spPr>
+                </pic:pic>
+              </a:graphicData>
+            </a:graphic>
+          </wp:inline>
+        </w:drawing>
+      </w:r>
+    </w:p>
+    <w:p>
+      <w:pPr>
+        <w:pStyle w:val="ImageCaption"/>
+      </w:pPr>
+      <w:r>
+        <w:t xml:space="preserve">demo — 8 of 8 steps green</w:t>
+      </w:r>
+    </w:p>
+    <w:p>
+      <w:pPr>
+        <w:pStyle w:val="BodyText"/>
+      </w:pPr>
+      <w:r>
+        <w:rPr>
           <w:b/>
         </w:rPr>
         <w:t xml:space="preserve">The demo transcript is the evidence</w:t>
@@ -1277,11 +1431,11 @@
       <w:pPr>
         <w:pStyle w:val="Heading2"/>
       </w:pPr>
-      <w:bookmarkStart w:id="25" w:name="what-we-found-while-building-it"/>
+      <w:bookmarkStart w:id="28" w:name="what-we-found-while-building-it"/>
       <w:r>
         <w:t xml:space="preserve">What we found while building it</w:t>
       </w:r>
-      <w:bookmarkEnd w:id="25"/>
+      <w:bookmarkEnd w:id="28"/>
     </w:p>
     <w:p>
       <w:pPr>
@@ -1502,11 +1656,11 @@
       <w:pPr>
         <w:pStyle w:val="Heading2"/>
       </w:pPr>
-      <w:bookmarkStart w:id="26" w:name="reproducing-it"/>
+      <w:bookmarkStart w:id="29" w:name="reproducing-it"/>
       <w:r>
         <w:t xml:space="preserve">Reproducing it</w:t>
       </w:r>
-      <w:bookmarkEnd w:id="26"/>
+      <w:bookmarkEnd w:id="29"/>
     </w:p>
     <w:p>
       <w:pPr>
@@ -1771,11 +1925,11 @@
       <w:pPr>
         <w:pStyle w:val="Heading2"/>
       </w:pPr>
-      <w:bookmarkStart w:id="27" w:name="running-it-after-the-challenge"/>
+      <w:bookmarkStart w:id="30" w:name="running-it-after-the-challenge"/>
       <w:r>
         <w:t xml:space="preserve">Running it after the challenge</w:t>
       </w:r>
-      <w:bookmarkEnd w:id="27"/>
+      <w:bookmarkEnd w:id="30"/>
     </w:p>
     <w:p>
       <w:pPr>

</xml_diff>

<commit_message>
Polish the submission: honest ledger wording, agent section, evidence, limits
- README: restructure around what it does / why it is an agent / why T3N-TEE /
  live demo / verification / security model / known limitations, with numbers
  taken from the runs rather than intended
- Replace "tamper-evident" and "immutable" ledger claims with append-only /
  write-once wording (README, INTERFACE, ARCHITECTURE, ledger.rs, interface.ts,
  world.wit)
- Say plainly that request-approval is unit-tested but absent from the demo
  transcript, and that the ledger has no independent cryptographic verification
- BUGLOG: add a category and impact table (DOC / DX / INT)
- HANDOVER: operator configuration table and a continuing-development section
- SUBMISSION: judging-criteria map, current limitations, reproducibility note;
  drop a policy field that the implementation does not have
- docs/evidence/decision-samples.md: decision lines quoted from a committed run
</commit_message>
<xml_diff>
--- a/docs/SUBMISSION.docx
+++ b/docs/SUBMISSION.docx
@@ -239,7 +239,7 @@
               <w:jc w:val="left"/>
             </w:pPr>
             <w:r>
-              <w:t xml:space="preserve">the rulebook: base currency, approval threshold, per-category limits, weekday restriction</w:t>
+              <w:t xml:space="preserve">the rulebook: base currency, approval threshold, default and per-category limits, duplicate window, FX cache TTL</w:t>
             </w:r>
           </w:p>
         </w:tc>
@@ -323,7 +323,7 @@
               <w:t xml:space="preserve"> </w:t>
             </w:r>
             <w:r>
-              <w:t xml:space="preserve">the enclave so PII never enters contract memory</w:t>
+              <w:t xml:space="preserve">the enclave so PII never enters contract memory. Covered by 15 unit tests; not part of the committed demo transcript</w:t>
             </w:r>
           </w:p>
         </w:tc>
@@ -1077,6 +1077,39 @@
               <w:jc w:val="left"/>
             </w:pPr>
             <w:r>
+              <w:t xml:space="preserve">reproducibility</w:t>
+            </w:r>
+          </w:p>
+        </w:tc>
+        <w:tc>
+          <w:p>
+            <w:pPr>
+              <w:pStyle w:val="Compact"/>
+              <w:jc w:val="left"/>
+            </w:pPr>
+            <w:r>
+              <w:t xml:space="preserve">rebuilding the contract from this source reproduces the deployed artifact byte-for-byte: 255,734 B, sha256</w:t>
+            </w:r>
+            <w:r>
+              <w:t xml:space="preserve"> </w:t>
+            </w:r>
+            <w:r>
+              <w:rPr>
+                <w:rStyle w:val="VerbatimChar"/>
+              </w:rPr>
+              <w:t xml:space="preserve">5dd3a964bc2e0b3f…</w:t>
+            </w:r>
+          </w:p>
+        </w:tc>
+      </w:tr>
+      <w:tr>
+        <w:tc>
+          <w:p>
+            <w:pPr>
+              <w:pStyle w:val="Compact"/>
+              <w:jc w:val="left"/>
+            </w:pPr>
+            <w:r>
               <w:t xml:space="preserve">live demo</w:t>
             </w:r>
           </w:p>
@@ -1088,7 +1121,7 @@
               <w:jc w:val="left"/>
             </w:pPr>
             <w:r>
-              <w:t xml:space="preserve">8 of 8 steps green on four consecutive runs, one of them via the documented</w:t>
+              <w:t xml:space="preserve">8 of 8 steps green on four consecutive runs, produced by the documented</w:t>
             </w:r>
             <w:r>
               <w:t xml:space="preserve"> </w:t>
@@ -1388,6 +1421,50 @@
         <w:pStyle w:val="BodyText"/>
       </w:pPr>
       <w:r>
+        <w:t xml:space="preserve">The actual decisions from that run — which rule fired, what the verdict was, what</w:t>
+      </w:r>
+      <w:r>
+        <w:t xml:space="preserve"> </w:t>
+      </w:r>
+      <w:r>
+        <w:t xml:space="preserve">the converted amount was — are quoted verbatim in</w:t>
+      </w:r>
+      <w:r>
+        <w:t xml:space="preserve"> </w:t>
+      </w:r>
+      <w:r>
+        <w:rPr>
+          <w:rStyle w:val="VerbatimChar"/>
+        </w:rPr>
+        <w:t xml:space="preserve">evidence/decision-samples.md</w:t>
+      </w:r>
+      <w:r>
+        <w:t xml:space="preserve">, and the whole session is replayable from the</w:t>
+      </w:r>
+      <w:r>
+        <w:t xml:space="preserve"> </w:t>
+      </w:r>
+      <w:r>
+        <w:t xml:space="preserve">committed transcripts in</w:t>
+      </w:r>
+      <w:r>
+        <w:t xml:space="preserve"> </w:t>
+      </w:r>
+      <w:r>
+        <w:rPr>
+          <w:rStyle w:val="VerbatimChar"/>
+        </w:rPr>
+        <w:t xml:space="preserve">client/demo-output/</w:t>
+      </w:r>
+      <w:r>
+        <w:t xml:space="preserve">.</w:t>
+      </w:r>
+    </w:p>
+    <w:p>
+      <w:pPr>
+        <w:pStyle w:val="BodyText"/>
+      </w:pPr>
+      <w:r>
         <w:rPr>
           <w:b/>
         </w:rPr>
@@ -1656,296 +1733,18 @@
       <w:pPr>
         <w:pStyle w:val="Heading2"/>
       </w:pPr>
-      <w:bookmarkStart w:id="29" w:name="reproducing-it"/>
-      <w:r>
-        <w:t xml:space="preserve">Reproducing it</w:t>
+      <w:bookmarkStart w:id="29" w:name="current-limitations"/>
+      <w:r>
+        <w:t xml:space="preserve">Current limitations</w:t>
       </w:r>
       <w:bookmarkEnd w:id="29"/>
     </w:p>
     <w:p>
       <w:pPr>
-        <w:pStyle w:val="SourceCode"/>
-      </w:pPr>
-      <w:r>
-        <w:rPr>
-          <w:rStyle w:val="CommentTok"/>
-        </w:rPr>
-        <w:t xml:space="preserve"># contract</w:t>
-      </w:r>
-      <w:r>
-        <w:br/>
-      </w:r>
-      <w:r>
-        <w:rPr>
-          <w:rStyle w:val="BuiltInTok"/>
-        </w:rPr>
-        <w:t xml:space="preserve">cd</w:t>
-      </w:r>
-      <w:r>
-        <w:rPr>
-          <w:rStyle w:val="NormalTok"/>
-        </w:rPr>
-        <w:t xml:space="preserve"> contract </w:t>
-      </w:r>
-      <w:r>
-        <w:rPr>
-          <w:rStyle w:val="KeywordTok"/>
-        </w:rPr>
-        <w:t xml:space="preserve">&amp;&amp;</w:t>
-      </w:r>
-      <w:r>
-        <w:rPr>
-          <w:rStyle w:val="NormalTok"/>
-        </w:rPr>
-        <w:t xml:space="preserve"> </w:t>
-      </w:r>
-      <w:r>
-        <w:rPr>
-          <w:rStyle w:val="ExtensionTok"/>
-        </w:rPr>
-        <w:t xml:space="preserve">cargo</w:t>
-      </w:r>
-      <w:r>
-        <w:rPr>
-          <w:rStyle w:val="NormalTok"/>
-        </w:rPr>
-        <w:t xml:space="preserve"> test </w:t>
-      </w:r>
-      <w:r>
-        <w:rPr>
-          <w:rStyle w:val="KeywordTok"/>
-        </w:rPr>
-        <w:t xml:space="preserve">&amp;&amp;</w:t>
-      </w:r>
-      <w:r>
-        <w:rPr>
-          <w:rStyle w:val="NormalTok"/>
-        </w:rPr>
-        <w:t xml:space="preserve"> </w:t>
-      </w:r>
-      <w:r>
-        <w:rPr>
-          <w:rStyle w:val="ExtensionTok"/>
-        </w:rPr>
-        <w:t xml:space="preserve">cargo</w:t>
-      </w:r>
-      <w:r>
-        <w:rPr>
-          <w:rStyle w:val="NormalTok"/>
-        </w:rPr>
-        <w:t xml:space="preserve"> build --target wasm32-wasip2 --release</w:t>
-      </w:r>
-      <w:r>
-        <w:br/>
-      </w:r>
-      <w:r>
-        <w:br/>
-      </w:r>
-      <w:r>
-        <w:rPr>
-          <w:rStyle w:val="CommentTok"/>
-        </w:rPr>
-        <w:t xml:space="preserve"># client (three credentials in client/.env, 0600)</w:t>
-      </w:r>
-      <w:r>
-        <w:br/>
-      </w:r>
-      <w:r>
-        <w:rPr>
-          <w:rStyle w:val="BuiltInTok"/>
-        </w:rPr>
-        <w:t xml:space="preserve">cd</w:t>
-      </w:r>
-      <w:r>
-        <w:rPr>
-          <w:rStyle w:val="NormalTok"/>
-        </w:rPr>
-        <w:t xml:space="preserve"> ../client </w:t>
-      </w:r>
-      <w:r>
-        <w:rPr>
-          <w:rStyle w:val="KeywordTok"/>
-        </w:rPr>
-        <w:t xml:space="preserve">&amp;&amp;</w:t>
-      </w:r>
-      <w:r>
-        <w:rPr>
-          <w:rStyle w:val="NormalTok"/>
-        </w:rPr>
-        <w:t xml:space="preserve"> </w:t>
-      </w:r>
-      <w:r>
-        <w:rPr>
-          <w:rStyle w:val="ExtensionTok"/>
-        </w:rPr>
-        <w:t xml:space="preserve">npm</w:t>
-      </w:r>
-      <w:r>
-        <w:rPr>
-          <w:rStyle w:val="NormalTok"/>
-        </w:rPr>
-        <w:t xml:space="preserve"> install </w:t>
-      </w:r>
-      <w:r>
-        <w:rPr>
-          <w:rStyle w:val="KeywordTok"/>
-        </w:rPr>
-        <w:t xml:space="preserve">&amp;&amp;</w:t>
-      </w:r>
-      <w:r>
-        <w:rPr>
-          <w:rStyle w:val="NormalTok"/>
-        </w:rPr>
-        <w:t xml:space="preserve"> </w:t>
-      </w:r>
-      <w:r>
-        <w:rPr>
-          <w:rStyle w:val="ExtensionTok"/>
-        </w:rPr>
-        <w:t xml:space="preserve">npm</w:t>
-      </w:r>
-      <w:r>
-        <w:rPr>
-          <w:rStyle w:val="NormalTok"/>
-        </w:rPr>
-        <w:t xml:space="preserve"> run doctor </w:t>
-      </w:r>
-      <w:r>
-        <w:rPr>
-          <w:rStyle w:val="KeywordTok"/>
-        </w:rPr>
-        <w:t xml:space="preserve">&amp;&amp;</w:t>
-      </w:r>
-      <w:r>
-        <w:rPr>
-          <w:rStyle w:val="NormalTok"/>
-        </w:rPr>
-        <w:t xml:space="preserve"> </w:t>
-      </w:r>
-      <w:r>
-        <w:rPr>
-          <w:rStyle w:val="ExtensionTok"/>
-        </w:rPr>
-        <w:t xml:space="preserve">npm</w:t>
-      </w:r>
-      <w:r>
-        <w:rPr>
-          <w:rStyle w:val="NormalTok"/>
-        </w:rPr>
-        <w:t xml:space="preserve"> run register</w:t>
-      </w:r>
-      <w:r>
-        <w:br/>
-      </w:r>
-      <w:r>
-        <w:rPr>
-          <w:rStyle w:val="ExtensionTok"/>
-        </w:rPr>
-        <w:t xml:space="preserve">npm</w:t>
-      </w:r>
-      <w:r>
-        <w:rPr>
-          <w:rStyle w:val="NormalTok"/>
-        </w:rPr>
-        <w:t xml:space="preserve"> run delegate </w:t>
-      </w:r>
-      <w:r>
-        <w:rPr>
-          <w:rStyle w:val="KeywordTok"/>
-        </w:rPr>
-        <w:t xml:space="preserve">&amp;&amp;</w:t>
-      </w:r>
-      <w:r>
-        <w:rPr>
-          <w:rStyle w:val="NormalTok"/>
-        </w:rPr>
-        <w:t xml:space="preserve"> </w:t>
-      </w:r>
-      <w:r>
-        <w:rPr>
-          <w:rStyle w:val="ExtensionTok"/>
-        </w:rPr>
-        <w:t xml:space="preserve">npm</w:t>
-      </w:r>
-      <w:r>
-        <w:rPr>
-          <w:rStyle w:val="NormalTok"/>
-        </w:rPr>
-        <w:t xml:space="preserve"> run demo</w:t>
-      </w:r>
-    </w:p>
-    <w:p>
-      <w:pPr>
         <w:pStyle w:val="FirstParagraph"/>
       </w:pPr>
       <w:r>
-        <w:rPr>
-          <w:rStyle w:val="VerbatimChar"/>
-        </w:rPr>
-        <w:t xml:space="preserve">docs/RUNBOOK.md</w:t>
-      </w:r>
-      <w:r>
-        <w:t xml:space="preserve"> </w:t>
-      </w:r>
-      <w:r>
-        <w:t xml:space="preserve">has the full sequence, the expected output and the failure modes;</w:t>
-      </w:r>
-      <w:r>
-        <w:t xml:space="preserve"> </w:t>
-      </w:r>
-      <w:r>
-        <w:rPr>
-          <w:rStyle w:val="VerbatimChar"/>
-        </w:rPr>
-        <w:t xml:space="preserve">docs/ARCHITECTURE.md</w:t>
-      </w:r>
-      <w:r>
-        <w:t xml:space="preserve"> </w:t>
-      </w:r>
-      <w:r>
-        <w:t xml:space="preserve">explains why the boundaries sit where they do;</w:t>
-      </w:r>
-      <w:r>
-        <w:t xml:space="preserve"> </w:t>
-      </w:r>
-      <w:r>
-        <w:rPr>
-          <w:rStyle w:val="VerbatimChar"/>
-        </w:rPr>
-        <w:t xml:space="preserve">docs/INTERFACE.md</w:t>
-      </w:r>
-      <w:r>
-        <w:t xml:space="preserve"> </w:t>
-      </w:r>
-      <w:r>
-        <w:t xml:space="preserve">is the frozen contract interface.</w:t>
-      </w:r>
-    </w:p>
-    <w:p>
-      <w:pPr>
-        <w:pStyle w:val="Heading2"/>
-      </w:pPr>
-      <w:bookmarkStart w:id="30" w:name="running-it-after-the-challenge"/>
-      <w:r>
-        <w:t xml:space="preserve">Running it after the challenge</w:t>
-      </w:r>
-      <w:bookmarkEnd w:id="30"/>
-    </w:p>
-    <w:p>
-      <w:pPr>
-        <w:pStyle w:val="FirstParagraph"/>
-      </w:pPr>
-      <w:r>
-        <w:rPr>
-          <w:rStyle w:val="VerbatimChar"/>
-        </w:rPr>
-        <w:t xml:space="preserve">docs/RUNBOOK.md</w:t>
-      </w:r>
-      <w:r>
-        <w:t xml:space="preserve"> </w:t>
-      </w:r>
-      <w:r>
-        <w:t xml:space="preserve">is the operator’s document: the deploy order, the expected output at every step, and the failure modes we actually hit. Nothing in the running system is bound to our accounts, so either path works:</w:t>
+        <w:t xml:space="preserve">Stated plainly, because a compliance deployment is judged on its weak edges:</w:t>
       </w:r>
     </w:p>
     <w:p>
@@ -1957,46 +1756,31 @@
         <w:pStyle w:val="Compact"/>
       </w:pPr>
       <w:r>
+        <w:t xml:space="preserve">The audit ledger is</w:t>
+      </w:r>
+      <w:r>
+        <w:t xml:space="preserve"> </w:t>
+      </w:r>
+      <w:r>
         <w:rPr>
           <w:b/>
         </w:rPr>
-        <w:t xml:space="preserve">We keep running it.</w:t>
-      </w:r>
-      <w:r>
-        <w:t xml:space="preserve"> </w:t>
-      </w:r>
-      <w:r>
-        <w:t xml:space="preserve">The tenant org, the agent and the registration stay ours; cost is metered per call through the host’s</w:t>
-      </w:r>
-      <w:r>
-        <w:t xml:space="preserve"> </w:t>
-      </w:r>
-      <w:r>
-        <w:rPr>
-          <w:rStyle w:val="VerbatimChar"/>
-        </w:rPr>
-        <w:t xml:space="preserve">token</w:t>
-      </w:r>
-      <w:r>
-        <w:t xml:space="preserve"> </w:t>
-      </w:r>
-      <w:r>
-        <w:t xml:space="preserve">capability, and the harness is one</w:t>
-      </w:r>
-      <w:r>
-        <w:t xml:space="preserve"> </w:t>
-      </w:r>
-      <w:r>
-        <w:rPr>
-          <w:rStyle w:val="VerbatimChar"/>
-        </w:rPr>
-        <w:t xml:space="preserve">npm ci</w:t>
-      </w:r>
-      <w:r>
-        <w:t xml:space="preserve"> </w:t>
-      </w:r>
-      <w:r>
-        <w:t xml:space="preserve">away from working.</w:t>
+        <w:t xml:space="preserve">append-only and sequence-numbered inside the TEE</w:t>
+      </w:r>
+      <w:r>
+        <w:t xml:space="preserve">, not</w:t>
+      </w:r>
+      <w:r>
+        <w:t xml:space="preserve"> </w:t>
+      </w:r>
+      <w:r>
+        <w:t xml:space="preserve">independently cryptographically verifiable: there is no per-record signature or</w:t>
+      </w:r>
+      <w:r>
+        <w:t xml:space="preserve"> </w:t>
+      </w:r>
+      <w:r>
+        <w:t xml:space="preserve">receipt a third party could check without trusting the operator’s attestation.</w:t>
       </w:r>
     </w:p>
     <w:p>
@@ -2004,6 +1788,1043 @@
         <w:numPr>
           <w:ilvl w:val="0"/>
           <w:numId w:val="1002"/>
+        </w:numPr>
+        <w:pStyle w:val="Compact"/>
+      </w:pPr>
+      <w:r>
+        <w:rPr>
+          <w:b/>
+        </w:rPr>
+        <w:t xml:space="preserve">One policy per tenant.</w:t>
+      </w:r>
+      <w:r>
+        <w:t xml:space="preserve"> </w:t>
+      </w:r>
+      <w:r>
+        <w:t xml:space="preserve">The policy map holds one</w:t>
+      </w:r>
+      <w:r>
+        <w:t xml:space="preserve"> </w:t>
+      </w:r>
+      <w:r>
+        <w:rPr>
+          <w:rStyle w:val="VerbatimChar"/>
+        </w:rPr>
+        <w:t xml:space="preserve">current</w:t>
+      </w:r>
+      <w:r>
+        <w:t xml:space="preserve"> </w:t>
+      </w:r>
+      <w:r>
+        <w:t xml:space="preserve">rulebook;</w:t>
+      </w:r>
+      <w:r>
+        <w:t xml:space="preserve"> </w:t>
+      </w:r>
+      <w:r>
+        <w:t xml:space="preserve">per-department policy sets would need a keying change.</w:t>
+      </w:r>
+    </w:p>
+    <w:p>
+      <w:pPr>
+        <w:numPr>
+          <w:ilvl w:val="0"/>
+          <w:numId w:val="1002"/>
+        </w:numPr>
+        <w:pStyle w:val="Compact"/>
+      </w:pPr>
+      <w:r>
+        <w:rPr>
+          <w:b/>
+        </w:rPr>
+        <w:t xml:space="preserve">Sequence allocation is read-then-increment.</w:t>
+      </w:r>
+      <w:r>
+        <w:t xml:space="preserve"> </w:t>
+      </w:r>
+      <w:r>
+        <w:t xml:space="preserve">KV exposes no atomic</w:t>
+      </w:r>
+      <w:r>
+        <w:t xml:space="preserve"> </w:t>
+      </w:r>
+      <w:r>
+        <w:t xml:space="preserve">compare-and-set through the host interface, so concurrent writers could collide.</w:t>
+      </w:r>
+      <w:r>
+        <w:t xml:space="preserve"> </w:t>
+      </w:r>
+      <w:r>
+        <w:t xml:space="preserve">Acceptable for a serial approval workflow, not for a high-throughput ledger.</w:t>
+      </w:r>
+    </w:p>
+    <w:p>
+      <w:pPr>
+        <w:numPr>
+          <w:ilvl w:val="0"/>
+          <w:numId w:val="1002"/>
+        </w:numPr>
+        <w:pStyle w:val="Compact"/>
+      </w:pPr>
+      <w:r>
+        <w:rPr>
+          <w:b/>
+        </w:rPr>
+        <w:t xml:space="preserve">External dependencies are trusted at runtime.</w:t>
+      </w:r>
+      <w:r>
+        <w:t xml:space="preserve"> </w:t>
+      </w:r>
+      <w:r>
+        <w:t xml:space="preserve">Approval delivery depends on</w:t>
+      </w:r>
+      <w:r>
+        <w:t xml:space="preserve"> </w:t>
+      </w:r>
+      <w:r>
+        <w:t xml:space="preserve">the configured webhook, FX on</w:t>
+      </w:r>
+      <w:r>
+        <w:t xml:space="preserve"> </w:t>
+      </w:r>
+      <w:r>
+        <w:rPr>
+          <w:rStyle w:val="VerbatimChar"/>
+        </w:rPr>
+        <w:t xml:space="preserve">open.er-api.com</w:t>
+      </w:r>
+      <w:r>
+        <w:t xml:space="preserve">; both degrade explicitly</w:t>
+      </w:r>
+      <w:r>
+        <w:t xml:space="preserve"> </w:t>
+      </w:r>
+      <w:r>
+        <w:t xml:space="preserve">(</w:t>
+      </w:r>
+      <w:r>
+        <w:rPr>
+          <w:rStyle w:val="VerbatimChar"/>
+        </w:rPr>
+        <w:t xml:space="preserve">status: "failed"</w:t>
+      </w:r>
+      <w:r>
+        <w:t xml:space="preserve">,</w:t>
+      </w:r>
+      <w:r>
+        <w:t xml:space="preserve"> </w:t>
+      </w:r>
+      <w:r>
+        <w:rPr>
+          <w:rStyle w:val="VerbatimChar"/>
+        </w:rPr>
+        <w:t xml:space="preserve">fx_unavailable</w:t>
+      </w:r>
+      <w:r>
+        <w:t xml:space="preserve">) instead of silently.</w:t>
+      </w:r>
+      <w:r>
+        <w:t xml:space="preserve"> </w:t>
+      </w:r>
+      <w:r>
+        <w:rPr>
+          <w:rStyle w:val="VerbatimChar"/>
+        </w:rPr>
+        <w:t xml:space="preserve">request-approval</w:t>
+      </w:r>
+      <w:r>
+        <w:t xml:space="preserve"> </w:t>
+      </w:r>
+      <w:r>
+        <w:t xml:space="preserve">itself is unit-tested but not exercised end to end in the committed demo, so</w:t>
+      </w:r>
+      <w:r>
+        <w:t xml:space="preserve"> </w:t>
+      </w:r>
+      <w:r>
+        <w:t xml:space="preserve">the webhook dispatch path has never run against a real endpoint here.</w:t>
+      </w:r>
+    </w:p>
+    <w:p>
+      <w:pPr>
+        <w:numPr>
+          <w:ilvl w:val="0"/>
+          <w:numId w:val="1002"/>
+        </w:numPr>
+        <w:pStyle w:val="Compact"/>
+      </w:pPr>
+      <w:r>
+        <w:rPr>
+          <w:b/>
+        </w:rPr>
+        <w:t xml:space="preserve">The client checks reachability, not attestation.</w:t>
+      </w:r>
+      <w:r>
+        <w:t xml:space="preserve"> </w:t>
+      </w:r>
+      <w:r>
+        <w:t xml:space="preserve">Nothing refuses to run</w:t>
+      </w:r>
+      <w:r>
+        <w:t xml:space="preserve"> </w:t>
+      </w:r>
+      <w:r>
+        <w:t xml:space="preserve">against an unexpected enclave measurement yet.</w:t>
+      </w:r>
+    </w:p>
+    <w:p>
+      <w:pPr>
+        <w:numPr>
+          <w:ilvl w:val="0"/>
+          <w:numId w:val="1002"/>
+        </w:numPr>
+        <w:pStyle w:val="Compact"/>
+      </w:pPr>
+      <w:r>
+        <w:rPr>
+          <w:b/>
+        </w:rPr>
+        <w:t xml:space="preserve">The agent holds a bearer token, not a key pair</w:t>
+      </w:r>
+      <w:r>
+        <w:t xml:space="preserve">, so it cannot prove key</w:t>
+      </w:r>
+      <w:r>
+        <w:t xml:space="preserve"> </w:t>
+      </w:r>
+      <w:r>
+        <w:t xml:space="preserve">possession to a third party; its authority is the delegation document plus the</w:t>
+      </w:r>
+      <w:r>
+        <w:t xml:space="preserve"> </w:t>
+      </w:r>
+      <w:r>
+        <w:t xml:space="preserve">host’s resolution of it.</w:t>
+      </w:r>
+    </w:p>
+    <w:p>
+      <w:pPr>
+        <w:pStyle w:val="Heading2"/>
+      </w:pPr>
+      <w:bookmarkStart w:id="30" w:name="how-this-maps-to-the-judging-criteria"/>
+      <w:r>
+        <w:t xml:space="preserve">How this maps to the judging criteria</w:t>
+      </w:r>
+      <w:bookmarkEnd w:id="30"/>
+    </w:p>
+    <w:tbl>
+      <w:tblPr>
+        <w:tblStyle w:val="Table"/>
+        <w:tblW w:type="pct" w:w="5000.0"/>
+        <w:tblLook w:firstRow="1"/>
+      </w:tblPr>
+      <w:tblGrid>
+        <w:gridCol w:w="3960"/>
+        <w:gridCol w:w="3960"/>
+      </w:tblGrid>
+      <w:tr>
+        <w:trPr>
+          <w:cnfStyle w:firstRow="1"/>
+        </w:trPr>
+        <w:tc>
+          <w:tcPr>
+            <w:tcBorders>
+              <w:bottom w:val="single"/>
+            </w:tcBorders>
+            <w:vAlign w:val="bottom"/>
+          </w:tcPr>
+          <w:p>
+            <w:pPr>
+              <w:pStyle w:val="Compact"/>
+              <w:jc w:val="left"/>
+            </w:pPr>
+            <w:r>
+              <w:t xml:space="preserve">Criterion</w:t>
+            </w:r>
+          </w:p>
+        </w:tc>
+        <w:tc>
+          <w:tcPr>
+            <w:tcBorders>
+              <w:bottom w:val="single"/>
+            </w:tcBorders>
+            <w:vAlign w:val="bottom"/>
+          </w:tcPr>
+          <w:p>
+            <w:pPr>
+              <w:pStyle w:val="Compact"/>
+              <w:jc w:val="left"/>
+            </w:pPr>
+            <w:r>
+              <w:t xml:space="preserve">Where to look</w:t>
+            </w:r>
+          </w:p>
+        </w:tc>
+      </w:tr>
+      <w:tr>
+        <w:tc>
+          <w:p>
+            <w:pPr>
+              <w:pStyle w:val="Compact"/>
+              <w:jc w:val="left"/>
+            </w:pPr>
+            <w:r>
+              <w:t xml:space="preserve">Usefulness</w:t>
+            </w:r>
+          </w:p>
+        </w:tc>
+        <w:tc>
+          <w:p>
+            <w:pPr>
+              <w:pStyle w:val="Compact"/>
+              <w:jc w:val="left"/>
+            </w:pPr>
+            <w:r>
+              <w:t xml:space="preserve">“</w:t>
+            </w:r>
+            <w:r>
+              <w:t xml:space="preserve">The problem it solves</w:t>
+            </w:r>
+            <w:r>
+              <w:t xml:space="preserve">”</w:t>
+            </w:r>
+            <w:r>
+              <w:t xml:space="preserve"> </w:t>
+            </w:r>
+            <w:r>
+              <w:t xml:space="preserve">above; the policy/ledger confidentiality argument in</w:t>
+            </w:r>
+            <w:r>
+              <w:t xml:space="preserve"> </w:t>
+            </w:r>
+            <w:r>
+              <w:rPr>
+                <w:rStyle w:val="VerbatimChar"/>
+              </w:rPr>
+              <w:t xml:space="preserve">README.md</w:t>
+            </w:r>
+          </w:p>
+        </w:tc>
+      </w:tr>
+      <w:tr>
+        <w:tc>
+          <w:p>
+            <w:pPr>
+              <w:pStyle w:val="Compact"/>
+              <w:jc w:val="left"/>
+            </w:pPr>
+            <w:r>
+              <w:t xml:space="preserve">Build quality</w:t>
+            </w:r>
+          </w:p>
+        </w:tc>
+        <w:tc>
+          <w:p>
+            <w:pPr>
+              <w:pStyle w:val="Compact"/>
+              <w:jc w:val="left"/>
+            </w:pPr>
+            <w:r>
+              <w:t xml:space="preserve">“</w:t>
+            </w:r>
+            <w:r>
+              <w:t xml:space="preserve">What actually runs</w:t>
+            </w:r>
+            <w:r>
+              <w:t xml:space="preserve">”</w:t>
+            </w:r>
+            <w:r>
+              <w:t xml:space="preserve"> </w:t>
+            </w:r>
+            <w:r>
+              <w:t xml:space="preserve">+</w:t>
+            </w:r>
+            <w:r>
+              <w:t xml:space="preserve"> </w:t>
+            </w:r>
+            <w:r>
+              <w:t xml:space="preserve">“</w:t>
+            </w:r>
+            <w:r>
+              <w:t xml:space="preserve">The authority model</w:t>
+            </w:r>
+            <w:r>
+              <w:t xml:space="preserve">”</w:t>
+            </w:r>
+            <w:r>
+              <w:t xml:space="preserve">;</w:t>
+            </w:r>
+            <w:r>
+              <w:t xml:space="preserve"> </w:t>
+            </w:r>
+            <w:r>
+              <w:rPr>
+                <w:rStyle w:val="VerbatimChar"/>
+              </w:rPr>
+              <w:t xml:space="preserve">docs/ARCHITECTURE.md</w:t>
+            </w:r>
+            <w:r>
+              <w:t xml:space="preserve">; 115 native tests</w:t>
+            </w:r>
+          </w:p>
+        </w:tc>
+      </w:tr>
+      <w:tr>
+        <w:tc>
+          <w:p>
+            <w:pPr>
+              <w:pStyle w:val="Compact"/>
+              <w:jc w:val="left"/>
+            </w:pPr>
+            <w:r>
+              <w:t xml:space="preserve">Ease of maintenance</w:t>
+            </w:r>
+          </w:p>
+        </w:tc>
+        <w:tc>
+          <w:p>
+            <w:pPr>
+              <w:pStyle w:val="Compact"/>
+              <w:jc w:val="left"/>
+            </w:pPr>
+            <w:r>
+              <w:rPr>
+                <w:rStyle w:val="VerbatimChar"/>
+              </w:rPr>
+              <w:t xml:space="preserve">docs/HANDOVER.md</w:t>
+            </w:r>
+            <w:r>
+              <w:t xml:space="preserve">,</w:t>
+            </w:r>
+            <w:r>
+              <w:t xml:space="preserve"> </w:t>
+            </w:r>
+            <w:r>
+              <w:rPr>
+                <w:rStyle w:val="VerbatimChar"/>
+              </w:rPr>
+              <w:t xml:space="preserve">docs/RUNBOOK.md</w:t>
+            </w:r>
+            <w:r>
+              <w:t xml:space="preserve">, the six documented npm commands, deterministic decisions,</w:t>
+            </w:r>
+            <w:r>
+              <w:t xml:space="preserve"> </w:t>
+            </w:r>
+            <w:r>
+              <w:rPr>
+                <w:rStyle w:val="VerbatimChar"/>
+              </w:rPr>
+              <w:t xml:space="preserve">AGENTS.md</w:t>
+            </w:r>
+          </w:p>
+        </w:tc>
+      </w:tr>
+      <w:tr>
+        <w:tc>
+          <w:p>
+            <w:pPr>
+              <w:pStyle w:val="Compact"/>
+              <w:jc w:val="left"/>
+            </w:pPr>
+            <w:r>
+              <w:t xml:space="preserve">Documentation quality</w:t>
+            </w:r>
+          </w:p>
+        </w:tc>
+        <w:tc>
+          <w:p>
+            <w:pPr>
+              <w:pStyle w:val="Compact"/>
+              <w:jc w:val="left"/>
+            </w:pPr>
+            <w:r>
+              <w:rPr>
+                <w:rStyle w:val="VerbatimChar"/>
+              </w:rPr>
+              <w:t xml:space="preserve">README.md</w:t>
+            </w:r>
+            <w:r>
+              <w:t xml:space="preserve"> </w:t>
+            </w:r>
+            <w:r>
+              <w:t xml:space="preserve">(overview),</w:t>
+            </w:r>
+            <w:r>
+              <w:t xml:space="preserve"> </w:t>
+            </w:r>
+            <w:r>
+              <w:rPr>
+                <w:rStyle w:val="VerbatimChar"/>
+              </w:rPr>
+              <w:t xml:space="preserve">docs/INTERFACE.md</w:t>
+            </w:r>
+            <w:r>
+              <w:t xml:space="preserve"> </w:t>
+            </w:r>
+            <w:r>
+              <w:t xml:space="preserve">(frozen interface),</w:t>
+            </w:r>
+            <w:r>
+              <w:t xml:space="preserve"> </w:t>
+            </w:r>
+            <w:r>
+              <w:rPr>
+                <w:rStyle w:val="VerbatimChar"/>
+              </w:rPr>
+              <w:t xml:space="preserve">docs/ARCHITECTURE.md</w:t>
+            </w:r>
+            <w:r>
+              <w:t xml:space="preserve"> </w:t>
+            </w:r>
+            <w:r>
+              <w:t xml:space="preserve">(threat model),</w:t>
+            </w:r>
+            <w:r>
+              <w:t xml:space="preserve"> </w:t>
+            </w:r>
+            <w:r>
+              <w:rPr>
+                <w:rStyle w:val="VerbatimChar"/>
+              </w:rPr>
+              <w:t xml:space="preserve">docs/BUGLOG.md</w:t>
+            </w:r>
+            <w:r>
+              <w:t xml:space="preserve"> </w:t>
+            </w:r>
+            <w:r>
+              <w:t xml:space="preserve">(defects)</w:t>
+            </w:r>
+          </w:p>
+        </w:tc>
+      </w:tr>
+      <w:tr>
+        <w:tc>
+          <w:p>
+            <w:pPr>
+              <w:pStyle w:val="Compact"/>
+              <w:jc w:val="left"/>
+            </w:pPr>
+            <w:r>
+              <w:t xml:space="preserve">Demo / evidence</w:t>
+            </w:r>
+          </w:p>
+        </w:tc>
+        <w:tc>
+          <w:p>
+            <w:pPr>
+              <w:pStyle w:val="Compact"/>
+              <w:jc w:val="left"/>
+            </w:pPr>
+            <w:r>
+              <w:t xml:space="preserve">“</w:t>
+            </w:r>
+            <w:r>
+              <w:t xml:space="preserve">Deployed and verified</w:t>
+            </w:r>
+            <w:r>
+              <w:t xml:space="preserve">”</w:t>
+            </w:r>
+            <w:r>
+              <w:t xml:space="preserve"> </w:t>
+            </w:r>
+            <w:r>
+              <w:t xml:space="preserve">+</w:t>
+            </w:r>
+            <w:r>
+              <w:t xml:space="preserve"> </w:t>
+            </w:r>
+            <w:r>
+              <w:t xml:space="preserve">“</w:t>
+            </w:r>
+            <w:r>
+              <w:t xml:space="preserve">Screenshots</w:t>
+            </w:r>
+            <w:r>
+              <w:t xml:space="preserve">”</w:t>
+            </w:r>
+            <w:r>
+              <w:t xml:space="preserve">;</w:t>
+            </w:r>
+            <w:r>
+              <w:t xml:space="preserve"> </w:t>
+            </w:r>
+            <w:r>
+              <w:rPr>
+                <w:rStyle w:val="VerbatimChar"/>
+              </w:rPr>
+              <w:t xml:space="preserve">client/demo-output/</w:t>
+            </w:r>
+            <w:r>
+              <w:t xml:space="preserve"> </w:t>
+            </w:r>
+            <w:r>
+              <w:t xml:space="preserve">transcripts;</w:t>
+            </w:r>
+            <w:r>
+              <w:t xml:space="preserve"> </w:t>
+            </w:r>
+            <w:r>
+              <w:rPr>
+                <w:rStyle w:val="VerbatimChar"/>
+              </w:rPr>
+              <w:t xml:space="preserve">docs/evidence/</w:t>
+            </w:r>
+          </w:p>
+        </w:tc>
+      </w:tr>
+      <w:tr>
+        <w:tc>
+          <w:p>
+            <w:pPr>
+              <w:pStyle w:val="Compact"/>
+              <w:jc w:val="left"/>
+            </w:pPr>
+            <w:r>
+              <w:t xml:space="preserve">Bug findings</w:t>
+            </w:r>
+          </w:p>
+        </w:tc>
+        <w:tc>
+          <w:p>
+            <w:pPr>
+              <w:pStyle w:val="Compact"/>
+              <w:jc w:val="left"/>
+            </w:pPr>
+            <w:r>
+              <w:t xml:space="preserve">“</w:t>
+            </w:r>
+            <w:r>
+              <w:t xml:space="preserve">What we found while building it</w:t>
+            </w:r>
+            <w:r>
+              <w:t xml:space="preserve">”</w:t>
+            </w:r>
+            <w:r>
+              <w:t xml:space="preserve"> </w:t>
+            </w:r>
+            <w:r>
+              <w:t xml:space="preserve">+</w:t>
+            </w:r>
+            <w:r>
+              <w:t xml:space="preserve"> </w:t>
+            </w:r>
+            <w:r>
+              <w:rPr>
+                <w:rStyle w:val="VerbatimChar"/>
+              </w:rPr>
+              <w:t xml:space="preserve">docs/BUGLOG.md</w:t>
+            </w:r>
+            <w:r>
+              <w:t xml:space="preserve"> </w:t>
+            </w:r>
+            <w:r>
+              <w:t xml:space="preserve">(15 entries, categorised and prioritised)</w:t>
+            </w:r>
+          </w:p>
+        </w:tc>
+      </w:tr>
+      <w:tr>
+        <w:tc>
+          <w:p>
+            <w:pPr>
+              <w:pStyle w:val="Compact"/>
+              <w:jc w:val="left"/>
+            </w:pPr>
+            <w:r>
+              <w:t xml:space="preserve">Handover</w:t>
+            </w:r>
+          </w:p>
+        </w:tc>
+        <w:tc>
+          <w:p>
+            <w:pPr>
+              <w:pStyle w:val="Compact"/>
+              <w:jc w:val="left"/>
+            </w:pPr>
+            <w:r>
+              <w:t xml:space="preserve">“</w:t>
+            </w:r>
+            <w:r>
+              <w:t xml:space="preserve">Running it after the challenge</w:t>
+            </w:r>
+            <w:r>
+              <w:t xml:space="preserve">”</w:t>
+            </w:r>
+            <w:r>
+              <w:t xml:space="preserve"> </w:t>
+            </w:r>
+            <w:r>
+              <w:t xml:space="preserve">+</w:t>
+            </w:r>
+            <w:r>
+              <w:t xml:space="preserve"> </w:t>
+            </w:r>
+            <w:r>
+              <w:rPr>
+                <w:rStyle w:val="VerbatimChar"/>
+              </w:rPr>
+              <w:t xml:space="preserve">docs/HANDOVER.md</w:t>
+            </w:r>
+            <w:r>
+              <w:t xml:space="preserve">, including the two traps</w:t>
+            </w:r>
+          </w:p>
+        </w:tc>
+      </w:tr>
+    </w:tbl>
+    <w:p>
+      <w:pPr>
+        <w:pStyle w:val="Heading2"/>
+      </w:pPr>
+      <w:bookmarkStart w:id="31" w:name="reproducing-it"/>
+      <w:r>
+        <w:t xml:space="preserve">Reproducing it</w:t>
+      </w:r>
+      <w:bookmarkEnd w:id="31"/>
+    </w:p>
+    <w:p>
+      <w:pPr>
+        <w:pStyle w:val="SourceCode"/>
+      </w:pPr>
+      <w:r>
+        <w:rPr>
+          <w:rStyle w:val="CommentTok"/>
+        </w:rPr>
+        <w:t xml:space="preserve"># contract</w:t>
+      </w:r>
+      <w:r>
+        <w:br/>
+      </w:r>
+      <w:r>
+        <w:rPr>
+          <w:rStyle w:val="BuiltInTok"/>
+        </w:rPr>
+        <w:t xml:space="preserve">cd</w:t>
+      </w:r>
+      <w:r>
+        <w:rPr>
+          <w:rStyle w:val="NormalTok"/>
+        </w:rPr>
+        <w:t xml:space="preserve"> contract </w:t>
+      </w:r>
+      <w:r>
+        <w:rPr>
+          <w:rStyle w:val="KeywordTok"/>
+        </w:rPr>
+        <w:t xml:space="preserve">&amp;&amp;</w:t>
+      </w:r>
+      <w:r>
+        <w:rPr>
+          <w:rStyle w:val="NormalTok"/>
+        </w:rPr>
+        <w:t xml:space="preserve"> </w:t>
+      </w:r>
+      <w:r>
+        <w:rPr>
+          <w:rStyle w:val="ExtensionTok"/>
+        </w:rPr>
+        <w:t xml:space="preserve">cargo</w:t>
+      </w:r>
+      <w:r>
+        <w:rPr>
+          <w:rStyle w:val="NormalTok"/>
+        </w:rPr>
+        <w:t xml:space="preserve"> test </w:t>
+      </w:r>
+      <w:r>
+        <w:rPr>
+          <w:rStyle w:val="KeywordTok"/>
+        </w:rPr>
+        <w:t xml:space="preserve">&amp;&amp;</w:t>
+      </w:r>
+      <w:r>
+        <w:rPr>
+          <w:rStyle w:val="NormalTok"/>
+        </w:rPr>
+        <w:t xml:space="preserve"> </w:t>
+      </w:r>
+      <w:r>
+        <w:rPr>
+          <w:rStyle w:val="ExtensionTok"/>
+        </w:rPr>
+        <w:t xml:space="preserve">cargo</w:t>
+      </w:r>
+      <w:r>
+        <w:rPr>
+          <w:rStyle w:val="NormalTok"/>
+        </w:rPr>
+        <w:t xml:space="preserve"> build --target wasm32-wasip2 --release</w:t>
+      </w:r>
+      <w:r>
+        <w:br/>
+      </w:r>
+      <w:r>
+        <w:br/>
+      </w:r>
+      <w:r>
+        <w:rPr>
+          <w:rStyle w:val="CommentTok"/>
+        </w:rPr>
+        <w:t xml:space="preserve"># client (three credentials in client/.env, 0600)</w:t>
+      </w:r>
+      <w:r>
+        <w:br/>
+      </w:r>
+      <w:r>
+        <w:rPr>
+          <w:rStyle w:val="BuiltInTok"/>
+        </w:rPr>
+        <w:t xml:space="preserve">cd</w:t>
+      </w:r>
+      <w:r>
+        <w:rPr>
+          <w:rStyle w:val="NormalTok"/>
+        </w:rPr>
+        <w:t xml:space="preserve"> ../client </w:t>
+      </w:r>
+      <w:r>
+        <w:rPr>
+          <w:rStyle w:val="KeywordTok"/>
+        </w:rPr>
+        <w:t xml:space="preserve">&amp;&amp;</w:t>
+      </w:r>
+      <w:r>
+        <w:rPr>
+          <w:rStyle w:val="NormalTok"/>
+        </w:rPr>
+        <w:t xml:space="preserve"> </w:t>
+      </w:r>
+      <w:r>
+        <w:rPr>
+          <w:rStyle w:val="ExtensionTok"/>
+        </w:rPr>
+        <w:t xml:space="preserve">npm</w:t>
+      </w:r>
+      <w:r>
+        <w:rPr>
+          <w:rStyle w:val="NormalTok"/>
+        </w:rPr>
+        <w:t xml:space="preserve"> install </w:t>
+      </w:r>
+      <w:r>
+        <w:rPr>
+          <w:rStyle w:val="KeywordTok"/>
+        </w:rPr>
+        <w:t xml:space="preserve">&amp;&amp;</w:t>
+      </w:r>
+      <w:r>
+        <w:rPr>
+          <w:rStyle w:val="NormalTok"/>
+        </w:rPr>
+        <w:t xml:space="preserve"> </w:t>
+      </w:r>
+      <w:r>
+        <w:rPr>
+          <w:rStyle w:val="ExtensionTok"/>
+        </w:rPr>
+        <w:t xml:space="preserve">npm</w:t>
+      </w:r>
+      <w:r>
+        <w:rPr>
+          <w:rStyle w:val="NormalTok"/>
+        </w:rPr>
+        <w:t xml:space="preserve"> run doctor </w:t>
+      </w:r>
+      <w:r>
+        <w:rPr>
+          <w:rStyle w:val="KeywordTok"/>
+        </w:rPr>
+        <w:t xml:space="preserve">&amp;&amp;</w:t>
+      </w:r>
+      <w:r>
+        <w:rPr>
+          <w:rStyle w:val="NormalTok"/>
+        </w:rPr>
+        <w:t xml:space="preserve"> </w:t>
+      </w:r>
+      <w:r>
+        <w:rPr>
+          <w:rStyle w:val="ExtensionTok"/>
+        </w:rPr>
+        <w:t xml:space="preserve">npm</w:t>
+      </w:r>
+      <w:r>
+        <w:rPr>
+          <w:rStyle w:val="NormalTok"/>
+        </w:rPr>
+        <w:t xml:space="preserve"> run register</w:t>
+      </w:r>
+      <w:r>
+        <w:br/>
+      </w:r>
+      <w:r>
+        <w:rPr>
+          <w:rStyle w:val="ExtensionTok"/>
+        </w:rPr>
+        <w:t xml:space="preserve">npm</w:t>
+      </w:r>
+      <w:r>
+        <w:rPr>
+          <w:rStyle w:val="NormalTok"/>
+        </w:rPr>
+        <w:t xml:space="preserve"> run delegate </w:t>
+      </w:r>
+      <w:r>
+        <w:rPr>
+          <w:rStyle w:val="KeywordTok"/>
+        </w:rPr>
+        <w:t xml:space="preserve">&amp;&amp;</w:t>
+      </w:r>
+      <w:r>
+        <w:rPr>
+          <w:rStyle w:val="NormalTok"/>
+        </w:rPr>
+        <w:t xml:space="preserve"> </w:t>
+      </w:r>
+      <w:r>
+        <w:rPr>
+          <w:rStyle w:val="ExtensionTok"/>
+        </w:rPr>
+        <w:t xml:space="preserve">npm</w:t>
+      </w:r>
+      <w:r>
+        <w:rPr>
+          <w:rStyle w:val="NormalTok"/>
+        </w:rPr>
+        <w:t xml:space="preserve"> run demo</w:t>
+      </w:r>
+    </w:p>
+    <w:p>
+      <w:pPr>
+        <w:pStyle w:val="FirstParagraph"/>
+      </w:pPr>
+      <w:r>
+        <w:rPr>
+          <w:rStyle w:val="VerbatimChar"/>
+        </w:rPr>
+        <w:t xml:space="preserve">docs/RUNBOOK.md</w:t>
+      </w:r>
+      <w:r>
+        <w:t xml:space="preserve"> </w:t>
+      </w:r>
+      <w:r>
+        <w:t xml:space="preserve">has the full sequence, the expected output and the failure modes;</w:t>
+      </w:r>
+      <w:r>
+        <w:t xml:space="preserve"> </w:t>
+      </w:r>
+      <w:r>
+        <w:rPr>
+          <w:rStyle w:val="VerbatimChar"/>
+        </w:rPr>
+        <w:t xml:space="preserve">docs/ARCHITECTURE.md</w:t>
+      </w:r>
+      <w:r>
+        <w:t xml:space="preserve"> </w:t>
+      </w:r>
+      <w:r>
+        <w:t xml:space="preserve">explains why the boundaries sit where they do;</w:t>
+      </w:r>
+      <w:r>
+        <w:t xml:space="preserve"> </w:t>
+      </w:r>
+      <w:r>
+        <w:rPr>
+          <w:rStyle w:val="VerbatimChar"/>
+        </w:rPr>
+        <w:t xml:space="preserve">docs/INTERFACE.md</w:t>
+      </w:r>
+      <w:r>
+        <w:t xml:space="preserve"> </w:t>
+      </w:r>
+      <w:r>
+        <w:t xml:space="preserve">is the frozen contract interface.</w:t>
+      </w:r>
+    </w:p>
+    <w:p>
+      <w:pPr>
+        <w:pStyle w:val="Heading2"/>
+      </w:pPr>
+      <w:bookmarkStart w:id="32" w:name="running-it-after-the-challenge"/>
+      <w:r>
+        <w:t xml:space="preserve">Running it after the challenge</w:t>
+      </w:r>
+      <w:bookmarkEnd w:id="32"/>
+    </w:p>
+    <w:p>
+      <w:pPr>
+        <w:pStyle w:val="FirstParagraph"/>
+      </w:pPr>
+      <w:r>
+        <w:rPr>
+          <w:rStyle w:val="VerbatimChar"/>
+        </w:rPr>
+        <w:t xml:space="preserve">docs/RUNBOOK.md</w:t>
+      </w:r>
+      <w:r>
+        <w:t xml:space="preserve"> </w:t>
+      </w:r>
+      <w:r>
+        <w:t xml:space="preserve">is the operator’s document: the deploy order, the expected output at every step, and the failure modes we actually hit. Nothing in the running system is bound to our accounts, so either path works:</w:t>
+      </w:r>
+    </w:p>
+    <w:p>
+      <w:pPr>
+        <w:numPr>
+          <w:ilvl w:val="0"/>
+          <w:numId w:val="1003"/>
+        </w:numPr>
+        <w:pStyle w:val="Compact"/>
+      </w:pPr>
+      <w:r>
+        <w:rPr>
+          <w:b/>
+        </w:rPr>
+        <w:t xml:space="preserve">We keep running it.</w:t>
+      </w:r>
+      <w:r>
+        <w:t xml:space="preserve"> </w:t>
+      </w:r>
+      <w:r>
+        <w:t xml:space="preserve">The tenant org, the agent and the registration stay ours; cost is metered per call through the host’s</w:t>
+      </w:r>
+      <w:r>
+        <w:t xml:space="preserve"> </w:t>
+      </w:r>
+      <w:r>
+        <w:rPr>
+          <w:rStyle w:val="VerbatimChar"/>
+        </w:rPr>
+        <w:t xml:space="preserve">token</w:t>
+      </w:r>
+      <w:r>
+        <w:t xml:space="preserve"> </w:t>
+      </w:r>
+      <w:r>
+        <w:t xml:space="preserve">capability, and the harness is one</w:t>
+      </w:r>
+      <w:r>
+        <w:t xml:space="preserve"> </w:t>
+      </w:r>
+      <w:r>
+        <w:rPr>
+          <w:rStyle w:val="VerbatimChar"/>
+        </w:rPr>
+        <w:t xml:space="preserve">npm ci</w:t>
+      </w:r>
+      <w:r>
+        <w:t xml:space="preserve"> </w:t>
+      </w:r>
+      <w:r>
+        <w:t xml:space="preserve">away from working.</w:t>
+      </w:r>
+    </w:p>
+    <w:p>
+      <w:pPr>
+        <w:numPr>
+          <w:ilvl w:val="0"/>
+          <w:numId w:val="1003"/>
         </w:numPr>
         <w:pStyle w:val="Compact"/>
       </w:pPr>
@@ -2406,6 +3227,9 @@
     <w:abstractNumId w:val="991"/>
   </w:num>
   <w:num w:numId="1002">
+    <w:abstractNumId w:val="991"/>
+  </w:num>
+  <w:num w:numId="1003">
     <w:abstractNumId w:val="991"/>
   </w:num>
 </w:numbering>

</xml_diff>